<commit_message>
feat: rename textbooks to chapter-prefixed format, update Social Sciences VII mappings, enhance PDF generators, update assessment constitutions, add TASK.md and Grade VI scaffolding
- Renamed English VII and Mathematics VII textbook PDFs to Chapter XX - Title format
- Removed legacy science VII mapping files (chapter_mappings_science_vii.json, grade_vii_science_mappings.json)
- Updated all 12 Social Sciences VII chapter mappings with refined competency data
- Added consolidated chapter_mappings_social_sciences_vii.json
- Enhanced assessment_pdf_generator.py and lp_pdf_generator.py with improved formatting
- Updated assessment constitutions for Science and Social Sciences (DOCX + runtime TXT)
- Added TASK.md for session-level task tracking
- Scaffolded Grade VI folders for Science and Social Sciences (textbooks + mirror/chapters)
- Updated lpa_page.html, CLAUDE.md, MEMORY.md with latest project state
- Minor fix in app.py and competency_mapping.md cowork prompt
</commit_message>
<xml_diff>
--- a/knowledge_commons/constitutions/assessment/science/Assessment_Constitution_Science.docx
+++ b/knowledge_commons/constitutions/assessment/science/Assessment_Constitution_Science.docx
@@ -3592,7 +3592,74 @@
           <w:sz w:val="19"/>
           <w:szCs w:val="19"/>
         </w:rPr>
-        <w:t xml:space="preserve">: must describe any visual provided to the student; null if none. The system MUST NOT invent visual stimulus requirements.</w:t>
+        <w:t xml:space="preserve">: the actual data table or visual content provided to the student, in pipe-delimited row format; null if no visual is required. The system MUST NOT invent visual stimulus requirements.</w:t>
+      </w:r>
+    </w:p>
+    <w:p>
+      <w:pPr>
+        <w:spacing w:after="60"/>
+      </w:pPr>
+      <w:r>
+        <w:rPr>
+          <w:rFonts w:ascii="Arial" w:cs="Arial" w:eastAsia="Arial" w:hAnsi="Arial"/>
+          <w:b/>
+          <w:bCs/>
+          <w:sz w:val="19"/>
+          <w:szCs w:val="19"/>
+        </w:rPr>
+        <w:t>CRITICAL — visual_stimulus rules (apply to ALL question types):</w:t>
+      </w:r>
+    </w:p>
+    <w:p>
+      <w:pPr>
+        <w:spacing w:after="40"/>
+      </w:pPr>
+      <w:r>
+        <w:rPr>
+          <w:rFonts w:ascii="Arial" w:cs="Arial" w:eastAsia="Arial" w:hAnsi="Arial"/>
+          <w:sz w:val="19"/>
+          <w:szCs w:val="19"/>
+        </w:rPr>
+        <w:t xml:space="preserve">VS-1 · When required: If a question requires the student to read a data table, visual_stimulus MUST contain the actual table as pipe-delimited rows — one row per line, columns separated by |. The first row is the header.</w:t>
+      </w:r>
+    </w:p>
+    <w:p>
+      <w:pPr>
+        <w:spacing w:after="40"/>
+      </w:pPr>
+      <w:r>
+        <w:rPr>
+          <w:rFonts w:ascii="Arial" w:cs="Arial" w:eastAsia="Arial" w:hAnsi="Arial"/>
+          <w:sz w:val="19"/>
+          <w:szCs w:val="19"/>
+        </w:rPr>
+        <w:t xml:space="preserve">VS-2 · What goes in visual_stimulus: The actual table data — rows and columns. A prose description (“A table is provided with columns X, Y, Z”) is prohibited.</w:t>
+      </w:r>
+    </w:p>
+    <w:p>
+      <w:pPr>
+        <w:spacing w:after="40"/>
+      </w:pPr>
+      <w:r>
+        <w:rPr>
+          <w:rFonts w:ascii="Arial" w:cs="Arial" w:eastAsia="Arial" w:hAnsi="Arial"/>
+          <w:sz w:val="19"/>
+          <w:szCs w:val="19"/>
+        </w:rPr>
+        <w:t xml:space="preserve">VS-3 · What goes in question_text / task / scaffold: A short reference phrase such as “Refer to the table provided.” Do NOT embed or describe the table there.</w:t>
+      </w:r>
+    </w:p>
+    <w:p>
+      <w:pPr>
+        <w:spacing w:after="60"/>
+      </w:pPr>
+      <w:r>
+        <w:rPr>
+          <w:rFonts w:ascii="Arial" w:cs="Arial" w:eastAsia="Arial" w:hAnsi="Arial"/>
+          <w:sz w:val="19"/>
+          <w:szCs w:val="19"/>
+        </w:rPr>
+        <w:t xml:space="preserve">VS-4 · When null is correct: visual_stimulus is null only when the question genuinely requires no table or diagram. A question that says “the table below shows…” but sets visual_stimulus to null is non-compliant.</w:t>
       </w:r>
     </w:p>
     <w:p>
@@ -3818,7 +3885,7 @@
           <w:sz w:val="18"/>
           <w:szCs w:val="18"/>
         </w:rPr>
-        <w:t xml:space="preserve">  "visual_stimulus": "string | null — describes any visual provided to the student; null if none",</w:t>
+        <w:t xml:space="preserve">  "visual_stimulus": "string | null — actual pipe-delimited table data provided to the student; null if no visual required. MUST be real rows, not a description.",</w:t>
       </w:r>
     </w:p>
     <w:p>

</xml_diff>